<commit_message>
Los tres lead magnets, desbloqueados. Solo queda el montaje.
Dayana confirmó las dos cosas que faltaban: Gabriel dio el visto bueno a la
estructura de la memoria de cálculo, y los cinco scripts de Dynamo se corrieron
en Revit. Los tres CTA pueden salir.

Actualizados los estados en la matriz de lead magnets, en los creativos de pauta
y en el calendario. El Word de montaje cambia su primer capítulo: donde decía
«lo que falta y quién lo cierra» ahora dice qué se desbloqueó y cuándo.

Queda un solo bloqueo vivo, y es de otra cosa: el creativo de pauta de ACERO no
sale hasta que el tutor esté en la portada de los cuatro cursos. Confirmado en
Estructuras; faltan Cerchas, Uniones y Modelado.

El workflow publica ahora la carpeta de entregables, para que los Word tengan
URL propia y se puedan mandar por WhatsApp sin adjuntar nada.

Co-Authored-By: Claude Opus 5 <noreply@anthropic.com>
Claude-Session: https://claude.ai/code/session_01KESLfcCy2ne1PvhuvNrN6q
</commit_message>
<xml_diff>
--- a/matriz-viral/entregables/Lead-Magnets-Septiembre-Montaje-GHL.docx
+++ b/matriz-viral/entregables/Lead-Magnets-Septiembre-Montaje-GHL.docx
@@ -248,7 +248,7 @@
                 <w:sz w:val="19"/>
                 <w:szCs w:val="19"/>
               </w:rPr>
-              <w:t xml:space="preserve">Listo para el CTA.</w:t>
+              <w:t xml:space="preserve">Listo.</w:t>
             </w:r>
             <w:r>
               <w:rPr>
@@ -324,32 +324,22 @@
             <w:r>
               <w:rPr>
                 <w:rFonts w:ascii="Nunito" w:cs="Nunito" w:eastAsia="Nunito" w:hAnsi="Nunito"/>
-                <w:b w:val="false"/>
-                <w:bCs w:val="false"/>
-                <w:sz w:val="19"/>
-                <w:szCs w:val="19"/>
-              </w:rPr>
-              <w:t xml:space="preserve">Estructura ya cruzada contra una memoria real. </w:t>
-            </w:r>
-            <w:r>
-              <w:rPr>
-                <w:rFonts w:ascii="Nunito" w:cs="Nunito" w:eastAsia="Nunito" w:hAnsi="Nunito"/>
                 <w:b/>
                 <w:bCs/>
                 <w:sz w:val="19"/>
                 <w:szCs w:val="19"/>
               </w:rPr>
-              <w:t xml:space="preserve">El CTA espera el visto bueno de Gabriel</w:t>
-            </w:r>
-            <w:r>
-              <w:rPr>
-                <w:rFonts w:ascii="Nunito" w:cs="Nunito" w:eastAsia="Nunito" w:hAnsi="Nunito"/>
-                <w:b w:val="false"/>
-                <w:bCs w:val="false"/>
-                <w:sz w:val="19"/>
-                <w:szCs w:val="19"/>
-              </w:rPr>
-              <w:t xml:space="preserve">.</w:t>
+              <w:t xml:space="preserve">Listo.</w:t>
+            </w:r>
+            <w:r>
+              <w:rPr>
+                <w:rFonts w:ascii="Nunito" w:cs="Nunito" w:eastAsia="Nunito" w:hAnsi="Nunito"/>
+                <w:b w:val="false"/>
+                <w:bCs w:val="false"/>
+                <w:sz w:val="19"/>
+                <w:szCs w:val="19"/>
+              </w:rPr>
+              <w:t xml:space="preserve"> Gabriel dio el visto bueno el 8-sep. Solo falta el montaje.</w:t>
             </w:r>
           </w:p>
         </w:tc>
@@ -415,32 +405,22 @@
             <w:r>
               <w:rPr>
                 <w:rFonts w:ascii="Nunito" w:cs="Nunito" w:eastAsia="Nunito" w:hAnsi="Nunito"/>
-                <w:b w:val="false"/>
-                <w:bCs w:val="false"/>
-                <w:sz w:val="19"/>
-                <w:szCs w:val="19"/>
-              </w:rPr>
-              <w:t xml:space="preserve">Montable ya, pero </w:t>
-            </w:r>
-            <w:r>
-              <w:rPr>
-                <w:rFonts w:ascii="Nunito" w:cs="Nunito" w:eastAsia="Nunito" w:hAnsi="Nunito"/>
                 <w:b/>
                 <w:bCs/>
                 <w:sz w:val="19"/>
                 <w:szCs w:val="19"/>
               </w:rPr>
-              <w:t xml:space="preserve">el CTA espera correr los 5 scripts en Revit</w:t>
-            </w:r>
-            <w:r>
-              <w:rPr>
-                <w:rFonts w:ascii="Nunito" w:cs="Nunito" w:eastAsia="Nunito" w:hAnsi="Nunito"/>
-                <w:b w:val="false"/>
-                <w:bCs w:val="false"/>
-                <w:sz w:val="19"/>
-                <w:szCs w:val="19"/>
-              </w:rPr>
-              <w:t xml:space="preserve">.</w:t>
+              <w:t xml:space="preserve">Listo.</w:t>
+            </w:r>
+            <w:r>
+              <w:rPr>
+                <w:rFonts w:ascii="Nunito" w:cs="Nunito" w:eastAsia="Nunito" w:hAnsi="Nunito"/>
+                <w:b w:val="false"/>
+                <w:bCs w:val="false"/>
+                <w:sz w:val="19"/>
+                <w:szCs w:val="19"/>
+              </w:rPr>
+              <w:t xml:space="preserve"> Los 5 scripts se corrieron en Revit el 8-sep. Solo falta el montaje.</w:t>
             </w:r>
           </w:p>
         </w:tc>
@@ -649,7 +629,7 @@
           <w:sz w:val="32"/>
           <w:szCs w:val="32"/>
         </w:rPr>
-        <w:t xml:space="preserve">Lo que falta, y quién lo cierra</w:t>
+        <w:t xml:space="preserve">Ya no queda nada bloqueado</w:t>
       </w:r>
     </w:p>
     <w:p>
@@ -664,279 +644,27 @@
           <w:sz w:val="21"/>
           <w:szCs w:val="21"/>
         </w:rPr>
-        <w:t xml:space="preserve">Esto va primero a propósito. Los tres recursos están en el aire —estar publicados no hace daño— pero </w:t>
-      </w:r>
-      <w:r>
-        <w:rPr>
-          <w:rFonts w:ascii="Nunito" w:cs="Nunito" w:eastAsia="Nunito" w:hAnsi="Nunito"/>
-          <w:b/>
-          <w:bCs/>
-          <w:sz w:val="21"/>
-          <w:szCs w:val="21"/>
-        </w:rPr>
-        <w:t xml:space="preserve">dos de ellos no pueden llevar CTA todavía</w:t>
-      </w:r>
-      <w:r>
-        <w:rPr>
-          <w:rFonts w:ascii="Nunito" w:cs="Nunito" w:eastAsia="Nunito" w:hAnsi="Nunito"/>
-          <w:b w:val="false"/>
-          <w:bCs w:val="false"/>
-          <w:sz w:val="21"/>
-          <w:szCs w:val="21"/>
-        </w:rPr>
-        <w:t xml:space="preserve">, y conviene que se sepa antes de montar nada.</w:t>
-      </w:r>
-    </w:p>
-    <w:p>
-      <w:pPr>
-        <w:spacing w:after="100" w:before="270"/>
-      </w:pPr>
-      <w:r>
-        <w:rPr>
-          <w:rFonts w:ascii="Overpass" w:cs="Overpass" w:eastAsia="Overpass" w:hAnsi="Overpass"/>
-          <w:b/>
-          <w:bCs/>
-          <w:color w:val="C96A1C"/>
-          <w:sz w:val="25"/>
-          <w:szCs w:val="25"/>
-        </w:rPr>
-        <w:t xml:space="preserve">1 · La memoria de cálculo: ya cruzada, falta el visto bueno</w:t>
-      </w:r>
-    </w:p>
-    <w:p>
-      <w:pPr>
-        <w:spacing w:after="110"/>
-      </w:pPr>
-      <w:r>
-        <w:rPr>
-          <w:rFonts w:ascii="Nunito" w:cs="Nunito" w:eastAsia="Nunito" w:hAnsi="Nunito"/>
-          <w:b/>
-          <w:bCs/>
-          <w:sz w:val="21"/>
-          <w:szCs w:val="21"/>
-        </w:rPr>
-        <w:t xml:space="preserve">8 de septiembre.</w:t>
-      </w:r>
-      <w:r>
-        <w:rPr>
-          <w:rFonts w:ascii="Nunito" w:cs="Nunito" w:eastAsia="Nunito" w:hAnsi="Nunito"/>
-          <w:b w:val="false"/>
-          <w:bCs w:val="false"/>
-          <w:sz w:val="21"/>
-          <w:szCs w:val="21"/>
-        </w:rPr>
-        <w:t xml:space="preserve"> La estructura se cruzó contra una memoria real de proyecto tipo (Robot Structural Analysis, NEC-SE-DS) y cambió bastante: de 13 a 12 secciones en otro orden, con </w:t>
-      </w:r>
-      <w:r>
-        <w:rPr>
-          <w:rFonts w:ascii="Nunito" w:cs="Nunito" w:eastAsia="Nunito" w:hAnsi="Nunito"/>
-          <w:b/>
-          <w:bCs/>
-          <w:sz w:val="21"/>
-          <w:szCs w:val="21"/>
-        </w:rPr>
-        <w:t xml:space="preserve">cálculo del cortante basal</w:t>
-      </w:r>
-      <w:r>
-        <w:rPr>
-          <w:rFonts w:ascii="Nunito" w:cs="Nunito" w:eastAsia="Nunito" w:hAnsi="Nunito"/>
-          <w:b w:val="false"/>
-          <w:bCs w:val="false"/>
-          <w:sz w:val="21"/>
-          <w:szCs w:val="21"/>
-        </w:rPr>
-        <w:t xml:space="preserve"> y </w:t>
-      </w:r>
-      <w:r>
-        <w:rPr>
-          <w:rFonts w:ascii="Nunito" w:cs="Nunito" w:eastAsia="Nunito" w:hAnsi="Nunito"/>
-          <w:b/>
-          <w:bCs/>
-          <w:sz w:val="21"/>
-          <w:szCs w:val="21"/>
-        </w:rPr>
-        <w:t xml:space="preserve">análisis modal</w:t>
-      </w:r>
-      <w:r>
-        <w:rPr>
-          <w:rFonts w:ascii="Nunito" w:cs="Nunito" w:eastAsia="Nunito" w:hAnsi="Nunito"/>
-          <w:b w:val="false"/>
-          <w:bCs w:val="false"/>
-          <w:sz w:val="21"/>
-          <w:szCs w:val="21"/>
-        </w:rPr>
-        <w:t xml:space="preserve"> como secciones propias, </w:t>
-      </w:r>
-      <w:r>
-        <w:rPr>
-          <w:rFonts w:ascii="Nunito" w:cs="Nunito" w:eastAsia="Nunito" w:hAnsi="Nunito"/>
-          <w:b/>
-          <w:bCs/>
-          <w:sz w:val="21"/>
-          <w:szCs w:val="21"/>
-        </w:rPr>
-        <w:t xml:space="preserve">«Limitación de daños»</w:t>
-      </w:r>
-      <w:r>
-        <w:rPr>
-          <w:rFonts w:ascii="Nunito" w:cs="Nunito" w:eastAsia="Nunito" w:hAnsi="Nunito"/>
-          <w:b w:val="false"/>
-          <w:bCs w:val="false"/>
-          <w:sz w:val="21"/>
-          <w:szCs w:val="21"/>
-        </w:rPr>
-        <w:t xml:space="preserve"> en vez de «estados límite de servicio», </w:t>
-      </w:r>
-      <w:r>
-        <w:rPr>
-          <w:rFonts w:ascii="Nunito" w:cs="Nunito" w:eastAsia="Nunito" w:hAnsi="Nunito"/>
-          <w:b/>
-          <w:bCs/>
-          <w:sz w:val="21"/>
-          <w:szCs w:val="21"/>
-        </w:rPr>
-        <w:t xml:space="preserve">Registro Senescyt</w:t>
-      </w:r>
-      <w:r>
-        <w:rPr>
-          <w:rFonts w:ascii="Nunito" w:cs="Nunito" w:eastAsia="Nunito" w:hAnsi="Nunito"/>
-          <w:b w:val="false"/>
-          <w:bCs w:val="false"/>
-          <w:sz w:val="21"/>
-          <w:szCs w:val="21"/>
-        </w:rPr>
-        <w:t xml:space="preserve"> en la portada, y una convención de figuras que antes no existía.</w:t>
-      </w:r>
-    </w:p>
-    <w:p>
-      <w:pPr>
-        <w:spacing w:after="110"/>
-      </w:pPr>
-      <w:r>
-        <w:rPr>
-          <w:rFonts w:ascii="Nunito" w:cs="Nunito" w:eastAsia="Nunito" w:hAnsi="Nunito"/>
-          <w:b w:val="false"/>
-          <w:bCs w:val="false"/>
-          <w:sz w:val="21"/>
-          <w:szCs w:val="21"/>
-        </w:rPr>
-        <w:t xml:space="preserve">También apareció una </w:t>
-      </w:r>
-      <w:r>
-        <w:rPr>
-          <w:rFonts w:ascii="Nunito" w:cs="Nunito" w:eastAsia="Nunito" w:hAnsi="Nunito"/>
-          <w:b/>
-          <w:bCs/>
-          <w:sz w:val="21"/>
-          <w:szCs w:val="21"/>
-        </w:rPr>
-        <w:t xml:space="preserve">sexta devolución</w:t>
-      </w:r>
-      <w:r>
-        <w:rPr>
-          <w:rFonts w:ascii="Nunito" w:cs="Nunito" w:eastAsia="Nunito" w:hAnsi="Nunito"/>
-          <w:b w:val="false"/>
-          <w:bCs w:val="false"/>
-          <w:sz w:val="21"/>
-          <w:szCs w:val="21"/>
-        </w:rPr>
-        <w:t xml:space="preserve">: el documento que se contradice a sí mismo — restos de haberlo armado partiendo de otro anterior. Es el error más fácil de encontrar y el que peor sienta al revisor.</w:t>
-      </w:r>
-    </w:p>
-    <w:p>
-      <w:pPr>
-        <w:pBdr>
-          <w:left w:val="single" w:color="1E7A55" w:sz="20" w:space="10"/>
-        </w:pBdr>
-        <w:shd w:fill="E2F0E9" w:val="clear"/>
-        <w:spacing w:after="170" w:before="150"/>
-      </w:pPr>
-      <w:r>
-        <w:rPr>
-          <w:rFonts w:ascii="Nunito" w:cs="Nunito" w:eastAsia="Nunito" w:hAnsi="Nunito"/>
-          <w:b w:val="false"/>
-          <w:bCs w:val="false"/>
-          <w:color w:val="1E7A55"/>
-          <w:sz w:val="21"/>
-          <w:szCs w:val="21"/>
-        </w:rPr>
-        <w:t xml:space="preserve">Ya no es una estructura teórica: sale de un documento que se entrega de verdad. Eso era lo que faltaba.</w:t>
-      </w:r>
-    </w:p>
-    <w:p>
-      <w:pPr>
-        <w:spacing w:after="110"/>
-      </w:pPr>
-      <w:r>
-        <w:rPr>
-          <w:rFonts w:ascii="Nunito" w:cs="Nunito" w:eastAsia="Nunito" w:hAnsi="Nunito"/>
-          <w:b/>
-          <w:bCs/>
-          <w:sz w:val="21"/>
-          <w:szCs w:val="21"/>
-        </w:rPr>
-        <w:t xml:space="preserve">Lo que sigue pendiente:</w:t>
-      </w:r>
-      <w:r>
-        <w:rPr>
-          <w:rFonts w:ascii="Nunito" w:cs="Nunito" w:eastAsia="Nunito" w:hAnsi="Nunito"/>
-          <w:b w:val="false"/>
-          <w:bCs w:val="false"/>
-          <w:sz w:val="21"/>
-          <w:szCs w:val="21"/>
-        </w:rPr>
-        <w:t xml:space="preserve"> que Gabriel la mire y diga si falta alguna sección para el tipo de memoria que él entrega, si el orden es el que usa, y si la plantilla no induce a omitir nada. Una cosa es cruzarla y otra que él la apruebe.</w:t>
-      </w:r>
-    </w:p>
-    <w:p>
-      <w:pPr>
-        <w:spacing w:after="100" w:before="270"/>
-      </w:pPr>
-      <w:r>
-        <w:rPr>
-          <w:rFonts w:ascii="Overpass" w:cs="Overpass" w:eastAsia="Overpass" w:hAnsi="Overpass"/>
-          <w:b/>
-          <w:bCs/>
-          <w:color w:val="C96A1C"/>
-          <w:sz w:val="25"/>
-          <w:szCs w:val="25"/>
-        </w:rPr>
-        <w:t xml:space="preserve">2 · Los 5 scripts de Dynamo hay que correrlos en Revit</w:t>
-      </w:r>
-    </w:p>
-    <w:p>
-      <w:pPr>
-        <w:spacing w:after="110"/>
-      </w:pPr>
-      <w:r>
-        <w:rPr>
-          <w:rFonts w:ascii="Nunito" w:cs="Nunito" w:eastAsia="Nunito" w:hAnsi="Nunito"/>
-          <w:b w:val="false"/>
-          <w:bCs w:val="false"/>
-          <w:sz w:val="21"/>
-          <w:szCs w:val="21"/>
-        </w:rPr>
-        <w:t xml:space="preserve">No hay Revit en el entorno donde se construyeron, así que </w:t>
-      </w:r>
-      <w:r>
-        <w:rPr>
-          <w:rFonts w:ascii="Nunito" w:cs="Nunito" w:eastAsia="Nunito" w:hAnsi="Nunito"/>
-          <w:b/>
-          <w:bCs/>
-          <w:sz w:val="21"/>
-          <w:szCs w:val="21"/>
-        </w:rPr>
-        <w:t xml:space="preserve">nadie los ha visto ejecutarse.</w:t>
-      </w:r>
-      <w:r>
-        <w:rPr>
-          <w:rFonts w:ascii="Nunito" w:cs="Nunito" w:eastAsia="Nunito" w:hAnsi="Nunito"/>
-          <w:b w:val="false"/>
-          <w:bCs w:val="false"/>
-          <w:sz w:val="21"/>
-          <w:szCs w:val="21"/>
-        </w:rPr>
-        <w:t xml:space="preserve"> Es semana 3, hay tiempo, pero hay que hacerlo.</w:t>
+        <w:t xml:space="preserve">Los tres recursos están construidos, publicados y </w:t>
+      </w:r>
+      <w:r>
+        <w:rPr>
+          <w:rFonts w:ascii="Nunito" w:cs="Nunito" w:eastAsia="Nunito" w:hAnsi="Nunito"/>
+          <w:b/>
+          <w:bCs/>
+          <w:sz w:val="21"/>
+          <w:szCs w:val="21"/>
+        </w:rPr>
+        <w:t xml:space="preserve">desbloqueados</w:t>
+      </w:r>
+      <w:r>
+        <w:rPr>
+          <w:rFonts w:ascii="Nunito" w:cs="Nunito" w:eastAsia="Nunito" w:hAnsi="Nunito"/>
+          <w:b w:val="false"/>
+          <w:bCs w:val="false"/>
+          <w:sz w:val="21"/>
+          <w:szCs w:val="21"/>
+        </w:rPr>
+        <w:t xml:space="preserve">. Esto es lo que cambió el 8 de septiembre:</w:t>
       </w:r>
     </w:p>
     <w:tbl>
@@ -952,8 +680,8 @@
         </w:tblBorders>
       </w:tblPr>
       <w:tblGrid>
-        <w:gridCol w:w="2400"/>
-        <w:gridCol w:w="6800"/>
+        <w:gridCol w:w="5200"/>
+        <w:gridCol w:w="4000"/>
       </w:tblGrid>
       <w:tr>
         <w:trPr>
@@ -961,7 +689,7 @@
         </w:trPr>
         <w:tc>
           <w:tcPr>
-            <w:tcW w:type="dxa" w:w="2400"/>
+            <w:tcW w:type="dxa" w:w="5200"/>
             <w:shd w:fill="0E2438" w:val="clear"/>
             <w:tcMar>
               <w:top w:type="dxa" w:w="90"/>
@@ -980,13 +708,13 @@
                 <w:sz w:val="19"/>
                 <w:szCs w:val="19"/>
               </w:rPr>
-              <w:t xml:space="preserve">Script</w:t>
-            </w:r>
-          </w:p>
-        </w:tc>
-        <w:tc>
-          <w:tcPr>
-            <w:tcW w:type="dxa" w:w="6800"/>
+              <w:t xml:space="preserve">Lo que faltaba</w:t>
+            </w:r>
+          </w:p>
+        </w:tc>
+        <w:tc>
+          <w:tcPr>
+            <w:tcW w:type="dxa" w:w="4000"/>
             <w:shd w:fill="0E2438" w:val="clear"/>
             <w:tcMar>
               <w:top w:type="dxa" w:w="90"/>
@@ -1005,7 +733,7 @@
                 <w:sz w:val="19"/>
                 <w:szCs w:val="19"/>
               </w:rPr>
-              <w:t xml:space="preserve">Qué hay que comprobar</w:t>
+              <w:t xml:space="preserve">Estado</w:t>
             </w:r>
           </w:p>
         </w:tc>
@@ -1013,47 +741,57 @@
       <w:tr>
         <w:tc>
           <w:tcPr>
-            <w:tcW w:type="dxa" w:w="2400"/>
-            <w:tcMar>
-              <w:top w:type="dxa" w:w="90"/>
-              <w:left w:type="dxa" w:w="130"/>
-              <w:bottom w:type="dxa" w:w="90"/>
-              <w:right w:type="dxa" w:w="130"/>
-            </w:tcMar>
-          </w:tcPr>
-          <w:p>
-            <w:r>
-              <w:rPr>
-                <w:rFonts w:ascii="Nunito" w:cs="Nunito" w:eastAsia="Nunito" w:hAnsi="Nunito"/>
-                <w:b w:val="false"/>
-                <w:bCs w:val="false"/>
-                <w:sz w:val="19"/>
-                <w:szCs w:val="19"/>
-              </w:rPr>
-              <w:t xml:space="preserve">01 · Advertencias</w:t>
-            </w:r>
-          </w:p>
-        </w:tc>
-        <w:tc>
-          <w:tcPr>
-            <w:tcW w:type="dxa" w:w="6800"/>
-            <w:tcMar>
-              <w:top w:type="dxa" w:w="90"/>
-              <w:left w:type="dxa" w:w="130"/>
-              <w:bottom w:type="dxa" w:w="90"/>
-              <w:right w:type="dxa" w:w="130"/>
-            </w:tcMar>
-          </w:tcPr>
-          <w:p>
-            <w:r>
-              <w:rPr>
-                <w:rFonts w:ascii="Nunito" w:cs="Nunito" w:eastAsia="Nunito" w:hAnsi="Nunito"/>
-                <w:b w:val="false"/>
-                <w:bCs w:val="false"/>
-                <w:sz w:val="19"/>
-                <w:szCs w:val="19"/>
-              </w:rPr>
-              <w:t xml:space="preserve">Que el CSV salga y que Excel abra los acentos bien.</w:t>
+            <w:tcW w:type="dxa" w:w="5200"/>
+            <w:tcMar>
+              <w:top w:type="dxa" w:w="90"/>
+              <w:left w:type="dxa" w:w="130"/>
+              <w:bottom w:type="dxa" w:w="90"/>
+              <w:right w:type="dxa" w:w="130"/>
+            </w:tcMar>
+          </w:tcPr>
+          <w:p>
+            <w:r>
+              <w:rPr>
+                <w:rFonts w:ascii="Nunito" w:cs="Nunito" w:eastAsia="Nunito" w:hAnsi="Nunito"/>
+                <w:b w:val="false"/>
+                <w:bCs w:val="false"/>
+                <w:sz w:val="19"/>
+                <w:szCs w:val="19"/>
+              </w:rPr>
+              <w:t xml:space="preserve">Que Gabriel revisara la estructura de la memoria de cálculo</w:t>
+            </w:r>
+          </w:p>
+        </w:tc>
+        <w:tc>
+          <w:tcPr>
+            <w:tcW w:type="dxa" w:w="4000"/>
+            <w:tcMar>
+              <w:top w:type="dxa" w:w="90"/>
+              <w:left w:type="dxa" w:w="130"/>
+              <w:bottom w:type="dxa" w:w="90"/>
+              <w:right w:type="dxa" w:w="130"/>
+            </w:tcMar>
+          </w:tcPr>
+          <w:p>
+            <w:r>
+              <w:rPr>
+                <w:rFonts w:ascii="Nunito" w:cs="Nunito" w:eastAsia="Nunito" w:hAnsi="Nunito"/>
+                <w:b/>
+                <w:bCs/>
+                <w:sz w:val="19"/>
+                <w:szCs w:val="19"/>
+              </w:rPr>
+              <w:t xml:space="preserve">Hecho</w:t>
+            </w:r>
+            <w:r>
+              <w:rPr>
+                <w:rFonts w:ascii="Nunito" w:cs="Nunito" w:eastAsia="Nunito" w:hAnsi="Nunito"/>
+                <w:b w:val="false"/>
+                <w:bCs w:val="false"/>
+                <w:sz w:val="19"/>
+                <w:szCs w:val="19"/>
+              </w:rPr>
+              <w:t xml:space="preserve"> — dio el visto bueno</w:t>
             </w:r>
           </w:p>
         </w:tc>
@@ -1061,47 +799,57 @@
       <w:tr>
         <w:tc>
           <w:tcPr>
-            <w:tcW w:type="dxa" w:w="2400"/>
-            <w:tcMar>
-              <w:top w:type="dxa" w:w="90"/>
-              <w:left w:type="dxa" w:w="130"/>
-              <w:bottom w:type="dxa" w:w="90"/>
-              <w:right w:type="dxa" w:w="130"/>
-            </w:tcMar>
-          </w:tcPr>
-          <w:p>
-            <w:r>
-              <w:rPr>
-                <w:rFonts w:ascii="Nunito" w:cs="Nunito" w:eastAsia="Nunito" w:hAnsi="Nunito"/>
-                <w:b w:val="false"/>
-                <w:bCs w:val="false"/>
-                <w:sz w:val="19"/>
-                <w:szCs w:val="19"/>
-              </w:rPr>
-              <w:t xml:space="preserve">02 · Duplicados</w:t>
-            </w:r>
-          </w:p>
-        </w:tc>
-        <w:tc>
-          <w:tcPr>
-            <w:tcW w:type="dxa" w:w="6800"/>
-            <w:tcMar>
-              <w:top w:type="dxa" w:w="90"/>
-              <w:left w:type="dxa" w:w="130"/>
-              <w:bottom w:type="dxa" w:w="90"/>
-              <w:right w:type="dxa" w:w="130"/>
-            </w:tcMar>
-          </w:tcPr>
-          <w:p>
-            <w:r>
-              <w:rPr>
-                <w:rFonts w:ascii="Nunito" w:cs="Nunito" w:eastAsia="Nunito" w:hAnsi="Nunito"/>
-                <w:b w:val="false"/>
-                <w:bCs w:val="false"/>
-                <w:sz w:val="19"/>
-                <w:szCs w:val="19"/>
-              </w:rPr>
-              <w:t xml:space="preserve">Duplicar un elemento a propósito y ver si lo encuentra.</w:t>
+            <w:tcW w:type="dxa" w:w="5200"/>
+            <w:tcMar>
+              <w:top w:type="dxa" w:w="90"/>
+              <w:left w:type="dxa" w:w="130"/>
+              <w:bottom w:type="dxa" w:w="90"/>
+              <w:right w:type="dxa" w:w="130"/>
+            </w:tcMar>
+          </w:tcPr>
+          <w:p>
+            <w:r>
+              <w:rPr>
+                <w:rFonts w:ascii="Nunito" w:cs="Nunito" w:eastAsia="Nunito" w:hAnsi="Nunito"/>
+                <w:b w:val="false"/>
+                <w:bCs w:val="false"/>
+                <w:sz w:val="19"/>
+                <w:szCs w:val="19"/>
+              </w:rPr>
+              <w:t xml:space="preserve">Correr los 5 scripts de Dynamo en Revit</w:t>
+            </w:r>
+          </w:p>
+        </w:tc>
+        <w:tc>
+          <w:tcPr>
+            <w:tcW w:type="dxa" w:w="4000"/>
+            <w:tcMar>
+              <w:top w:type="dxa" w:w="90"/>
+              <w:left w:type="dxa" w:w="130"/>
+              <w:bottom w:type="dxa" w:w="90"/>
+              <w:right w:type="dxa" w:w="130"/>
+            </w:tcMar>
+          </w:tcPr>
+          <w:p>
+            <w:r>
+              <w:rPr>
+                <w:rFonts w:ascii="Nunito" w:cs="Nunito" w:eastAsia="Nunito" w:hAnsi="Nunito"/>
+                <w:b/>
+                <w:bCs/>
+                <w:sz w:val="19"/>
+                <w:szCs w:val="19"/>
+              </w:rPr>
+              <w:t xml:space="preserve">Hecho</w:t>
+            </w:r>
+            <w:r>
+              <w:rPr>
+                <w:rFonts w:ascii="Nunito" w:cs="Nunito" w:eastAsia="Nunito" w:hAnsi="Nunito"/>
+                <w:b w:val="false"/>
+                <w:bCs w:val="false"/>
+                <w:sz w:val="19"/>
+                <w:szCs w:val="19"/>
+              </w:rPr>
+              <w:t xml:space="preserve"> — se corrieron</w:t>
             </w:r>
           </w:p>
         </w:tc>
@@ -1109,30 +857,30 @@
       <w:tr>
         <w:tc>
           <w:tcPr>
-            <w:tcW w:type="dxa" w:w="2400"/>
-            <w:tcMar>
-              <w:top w:type="dxa" w:w="90"/>
-              <w:left w:type="dxa" w:w="130"/>
-              <w:bottom w:type="dxa" w:w="90"/>
-              <w:right w:type="dxa" w:w="130"/>
-            </w:tcMar>
-          </w:tcPr>
-          <w:p>
-            <w:r>
-              <w:rPr>
-                <w:rFonts w:ascii="Nunito" w:cs="Nunito" w:eastAsia="Nunito" w:hAnsi="Nunito"/>
-                <w:b w:val="false"/>
-                <w:bCs w:val="false"/>
-                <w:sz w:val="19"/>
-                <w:szCs w:val="19"/>
-              </w:rPr>
-              <w:t xml:space="preserve">03 · Renombrar vistas</w:t>
-            </w:r>
-          </w:p>
-        </w:tc>
-        <w:tc>
-          <w:tcPr>
-            <w:tcW w:type="dxa" w:w="6800"/>
+            <w:tcW w:type="dxa" w:w="5200"/>
+            <w:tcMar>
+              <w:top w:type="dxa" w:w="90"/>
+              <w:left w:type="dxa" w:w="130"/>
+              <w:bottom w:type="dxa" w:w="90"/>
+              <w:right w:type="dxa" w:w="130"/>
+            </w:tcMar>
+          </w:tcPr>
+          <w:p>
+            <w:r>
+              <w:rPr>
+                <w:rFonts w:ascii="Nunito" w:cs="Nunito" w:eastAsia="Nunito" w:hAnsi="Nunito"/>
+                <w:b w:val="false"/>
+                <w:bCs w:val="false"/>
+                <w:sz w:val="19"/>
+                <w:szCs w:val="19"/>
+              </w:rPr>
+              <w:t xml:space="preserve">Montarlos en GoHighLevel</w:t>
+            </w:r>
+          </w:p>
+        </w:tc>
+        <w:tc>
+          <w:tcPr>
+            <w:tcW w:type="dxa" w:w="4000"/>
             <w:tcMar>
               <w:top w:type="dxa" w:w="90"/>
               <w:left w:type="dxa" w:w="130"/>
@@ -1149,128 +897,103 @@
                 <w:sz w:val="19"/>
                 <w:szCs w:val="19"/>
               </w:rPr>
-              <w:t xml:space="preserve">El simulacro primero.</w:t>
-            </w:r>
-            <w:r>
-              <w:rPr>
-                <w:rFonts w:ascii="Nunito" w:cs="Nunito" w:eastAsia="Nunito" w:hAnsi="Nunito"/>
-                <w:b w:val="false"/>
-                <w:bCs w:val="false"/>
-                <w:sz w:val="19"/>
-                <w:szCs w:val="19"/>
-              </w:rPr>
-              <w:t xml:space="preserve"> Que la lista «antes → después» sea correcta.</w:t>
-            </w:r>
-          </w:p>
-        </w:tc>
-      </w:tr>
-      <w:tr>
-        <w:tc>
-          <w:tcPr>
-            <w:tcW w:type="dxa" w:w="2400"/>
-            <w:tcMar>
-              <w:top w:type="dxa" w:w="90"/>
-              <w:left w:type="dxa" w:w="130"/>
-              <w:bottom w:type="dxa" w:w="90"/>
-              <w:right w:type="dxa" w:w="130"/>
-            </w:tcMar>
-          </w:tcPr>
-          <w:p>
-            <w:r>
-              <w:rPr>
-                <w:rFonts w:ascii="Nunito" w:cs="Nunito" w:eastAsia="Nunito" w:hAnsi="Nunito"/>
-                <w:b w:val="false"/>
-                <w:bCs w:val="false"/>
-                <w:sz w:val="19"/>
-                <w:szCs w:val="19"/>
-              </w:rPr>
-              <w:t xml:space="preserve">04 · Vistas sin hoja</w:t>
-            </w:r>
-          </w:p>
-        </w:tc>
-        <w:tc>
-          <w:tcPr>
-            <w:tcW w:type="dxa" w:w="6800"/>
-            <w:tcMar>
-              <w:top w:type="dxa" w:w="90"/>
-              <w:left w:type="dxa" w:w="130"/>
-              <w:bottom w:type="dxa" w:w="90"/>
-              <w:right w:type="dxa" w:w="130"/>
-            </w:tcMar>
-          </w:tcPr>
-          <w:p>
-            <w:r>
-              <w:rPr>
-                <w:rFonts w:ascii="Nunito" w:cs="Nunito" w:eastAsia="Nunito" w:hAnsi="Nunito"/>
-                <w:b w:val="false"/>
-                <w:bCs w:val="false"/>
-                <w:sz w:val="19"/>
-                <w:szCs w:val="19"/>
-              </w:rPr>
-              <w:t xml:space="preserve">Que no liste plantillas ni tablas.</w:t>
-            </w:r>
-          </w:p>
-        </w:tc>
-      </w:tr>
-      <w:tr>
-        <w:tc>
-          <w:tcPr>
-            <w:tcW w:type="dxa" w:w="2400"/>
-            <w:tcMar>
-              <w:top w:type="dxa" w:w="90"/>
-              <w:left w:type="dxa" w:w="130"/>
-              <w:bottom w:type="dxa" w:w="90"/>
-              <w:right w:type="dxa" w:w="130"/>
-            </w:tcMar>
-          </w:tcPr>
-          <w:p>
-            <w:r>
-              <w:rPr>
-                <w:rFonts w:ascii="Nunito" w:cs="Nunito" w:eastAsia="Nunito" w:hAnsi="Nunito"/>
-                <w:b w:val="false"/>
-                <w:bCs w:val="false"/>
-                <w:sz w:val="19"/>
-                <w:szCs w:val="19"/>
-              </w:rPr>
-              <w:t xml:space="preserve">05 · Parámetro en lote</w:t>
-            </w:r>
-          </w:p>
-        </w:tc>
-        <w:tc>
-          <w:tcPr>
-            <w:tcW w:type="dxa" w:w="6800"/>
-            <w:tcMar>
-              <w:top w:type="dxa" w:w="90"/>
-              <w:left w:type="dxa" w:w="130"/>
-              <w:bottom w:type="dxa" w:w="90"/>
-              <w:right w:type="dxa" w:w="130"/>
-            </w:tcMar>
-          </w:tcPr>
-          <w:p>
-            <w:r>
-              <w:rPr>
-                <w:rFonts w:ascii="Nunito" w:cs="Nunito" w:eastAsia="Nunito" w:hAnsi="Nunito"/>
-                <w:b/>
-                <w:bCs/>
-                <w:sz w:val="19"/>
-                <w:szCs w:val="19"/>
-              </w:rPr>
-              <w:t xml:space="preserve">El simulacro primero.</w:t>
-            </w:r>
-            <w:r>
-              <w:rPr>
-                <w:rFonts w:ascii="Nunito" w:cs="Nunito" w:eastAsia="Nunito" w:hAnsi="Nunito"/>
-                <w:b w:val="false"/>
-                <w:bCs w:val="false"/>
-                <w:sz w:val="19"/>
-                <w:szCs w:val="19"/>
-              </w:rPr>
-              <w:t xml:space="preserve"> Que el conteo de «sin parámetro» cuadre.</w:t>
+              <w:t xml:space="preserve">Es lo único que queda, y es esta guía</w:t>
             </w:r>
           </w:p>
         </w:tc>
       </w:tr>
     </w:tbl>
+    <w:p>
+      <w:pPr>
+        <w:pBdr>
+          <w:left w:val="single" w:color="1E7A55" w:sz="20" w:space="10"/>
+        </w:pBdr>
+        <w:shd w:fill="E2F0E9" w:val="clear"/>
+        <w:spacing w:after="170" w:before="150"/>
+      </w:pPr>
+      <w:r>
+        <w:rPr>
+          <w:rFonts w:ascii="Nunito" w:cs="Nunito" w:eastAsia="Nunito" w:hAnsi="Nunito"/>
+          <w:b w:val="false"/>
+          <w:bCs w:val="false"/>
+          <w:color w:val="1E7A55"/>
+          <w:sz w:val="21"/>
+          <w:szCs w:val="21"/>
+        </w:rPr>
+        <w:t xml:space="preserve">Los tres CTA pueden salir. Ya no hay que esperar a nadie: lo único entre estos recursos y las campañas es el montaje que viene a continuación.</w:t>
+      </w:r>
+    </w:p>
+    <w:p>
+      <w:pPr>
+        <w:spacing w:after="100" w:before="270"/>
+      </w:pPr>
+      <w:r>
+        <w:rPr>
+          <w:rFonts w:ascii="Overpass" w:cs="Overpass" w:eastAsia="Overpass" w:hAnsi="Overpass"/>
+          <w:b/>
+          <w:bCs/>
+          <w:color w:val="C96A1C"/>
+          <w:sz w:val="25"/>
+          <w:szCs w:val="25"/>
+        </w:rPr>
+        <w:t xml:space="preserve">Una sola cosa sigue esperando</w:t>
+      </w:r>
+    </w:p>
+    <w:p>
+      <w:pPr>
+        <w:spacing w:after="110"/>
+      </w:pPr>
+      <w:r>
+        <w:rPr>
+          <w:rFonts w:ascii="Nunito" w:cs="Nunito" w:eastAsia="Nunito" w:hAnsi="Nunito"/>
+          <w:b w:val="false"/>
+          <w:bCs w:val="false"/>
+          <w:sz w:val="21"/>
+          <w:szCs w:val="21"/>
+        </w:rPr>
+        <w:t xml:space="preserve">El creativo de pauta de </w:t>
+      </w:r>
+      <w:r>
+        <w:rPr>
+          <w:rFonts w:ascii="Nunito" w:cs="Nunito" w:eastAsia="Nunito" w:hAnsi="Nunito"/>
+          <w:b/>
+          <w:bCs/>
+          <w:sz w:val="21"/>
+          <w:szCs w:val="21"/>
+        </w:rPr>
+        <w:t xml:space="preserve">ACERO con el tutor de IA</w:t>
+      </w:r>
+      <w:r>
+        <w:rPr>
+          <w:rFonts w:ascii="Nunito" w:cs="Nunito" w:eastAsia="Nunito" w:hAnsi="Nunito"/>
+          <w:b w:val="false"/>
+          <w:bCs w:val="false"/>
+          <w:sz w:val="21"/>
+          <w:szCs w:val="21"/>
+        </w:rPr>
+        <w:t xml:space="preserve"> no se graba ni se sube hasta que el tutor esté montado en la portada de los </w:t>
+      </w:r>
+      <w:r>
+        <w:rPr>
+          <w:rFonts w:ascii="Nunito" w:cs="Nunito" w:eastAsia="Nunito" w:hAnsi="Nunito"/>
+          <w:b/>
+          <w:bCs/>
+          <w:sz w:val="21"/>
+          <w:szCs w:val="21"/>
+        </w:rPr>
+        <w:t xml:space="preserve">cuatro</w:t>
+      </w:r>
+      <w:r>
+        <w:rPr>
+          <w:rFonts w:ascii="Nunito" w:cs="Nunito" w:eastAsia="Nunito" w:hAnsi="Nunito"/>
+          <w:b w:val="false"/>
+          <w:bCs w:val="false"/>
+          <w:sz w:val="21"/>
+          <w:szCs w:val="21"/>
+        </w:rPr>
+        <w:t xml:space="preserve"> cursos. Está confirmado en Estructuras; faltan Cerchas, Uniones y Modelado.</w:t>
+      </w:r>
+    </w:p>
     <w:p>
       <w:pPr>
         <w:pBdr>
@@ -1288,98 +1011,7 @@
           <w:sz w:val="21"/>
           <w:szCs w:val="21"/>
         </w:rPr>
-        <w:t xml:space="preserve">Los dos que modifican el modelo (03 y 05) traen el simulacro ENCENDIDO por defecto: la primera ejecución no puede romper nada aunque falle. Aun así, guarda el proyecto antes.</w:t>
-      </w:r>
-    </w:p>
-    <w:p>
-      <w:pPr>
-        <w:spacing w:after="110"/>
-      </w:pPr>
-      <w:r>
-        <w:rPr>
-          <w:rFonts w:ascii="Nunito" w:cs="Nunito" w:eastAsia="Nunito" w:hAnsi="Nunito"/>
-          <w:b/>
-          <w:bCs/>
-          <w:sz w:val="21"/>
-          <w:szCs w:val="21"/>
-        </w:rPr>
-        <w:t xml:space="preserve">Lo que sí está comprobado</w:t>
-      </w:r>
-      <w:r>
-        <w:rPr>
-          <w:rFonts w:ascii="Nunito" w:cs="Nunito" w:eastAsia="Nunito" w:hAnsi="Nunito"/>
-          <w:b w:val="false"/>
-          <w:bCs w:val="false"/>
-          <w:sz w:val="21"/>
-          <w:szCs w:val="21"/>
-        </w:rPr>
-        <w:t xml:space="preserve"> de los scripts, para que no se empiece de cero: la sintaxis de los cinco; que corren igual en IronPython 2 y en CPython 3 (Revit 2023 en adelante) — aquí había un fallo real y estaba en el script 01; que las llamadas a la API existen, verificado contra la documentación oficial de Autodesk; y la lógica que no depende de Revit, probada con casos.</w:t>
-      </w:r>
-    </w:p>
-    <w:p>
-      <w:pPr>
-        <w:spacing w:after="100" w:before="270"/>
-      </w:pPr>
-      <w:r>
-        <w:rPr>
-          <w:rFonts w:ascii="Overpass" w:cs="Overpass" w:eastAsia="Overpass" w:hAnsi="Overpass"/>
-          <w:b/>
-          <w:bCs/>
-          <w:color w:val="C96A1C"/>
-          <w:sz w:val="25"/>
-          <w:szCs w:val="25"/>
-        </w:rPr>
-        <w:t xml:space="preserve">3 · Abrir el Word y el Excel de la memoria</w:t>
-      </w:r>
-    </w:p>
-    <w:p>
-      <w:pPr>
-        <w:spacing w:after="110"/>
-      </w:pPr>
-      <w:r>
-        <w:rPr>
-          <w:rFonts w:ascii="Nunito" w:cs="Nunito" w:eastAsia="Nunito" w:hAnsi="Nunito"/>
-          <w:b w:val="false"/>
-          <w:bCs w:val="false"/>
-          <w:sz w:val="21"/>
-          <w:szCs w:val="21"/>
-        </w:rPr>
-        <w:t xml:space="preserve">Los dos ficheros se generan automáticamente y están verificados por estructura y por lógica, pero </w:t>
-      </w:r>
-      <w:r>
-        <w:rPr>
-          <w:rFonts w:ascii="Nunito" w:cs="Nunito" w:eastAsia="Nunito" w:hAnsi="Nunito"/>
-          <w:b/>
-          <w:bCs/>
-          <w:sz w:val="21"/>
-          <w:szCs w:val="21"/>
-        </w:rPr>
-        <w:t xml:space="preserve">en el entorno donde se construyeron no hay Word ni Excel de verdad</w:t>
-      </w:r>
-      <w:r>
-        <w:rPr>
-          <w:rFonts w:ascii="Nunito" w:cs="Nunito" w:eastAsia="Nunito" w:hAnsi="Nunito"/>
-          <w:b w:val="false"/>
-          <w:bCs w:val="false"/>
-          <w:sz w:val="21"/>
-          <w:szCs w:val="21"/>
-        </w:rPr>
-        <w:t xml:space="preserve"> para abrirlos. Alguien tiene que hacerlo una vez.</w:t>
-      </w:r>
-    </w:p>
-    <w:p>
-      <w:pPr>
-        <w:spacing w:after="110"/>
-      </w:pPr>
-      <w:r>
-        <w:rPr>
-          <w:rFonts w:ascii="Nunito" w:cs="Nunito" w:eastAsia="Nunito" w:hAnsi="Nunito"/>
-          <w:b w:val="false"/>
-          <w:bCs w:val="false"/>
-          <w:sz w:val="21"/>
-          <w:szCs w:val="21"/>
-        </w:rPr>
-        <w:t xml:space="preserve">En el Excel: escribe una solicitación en la columna C y una resistencia en la D, y comprueba que el ratio y el CUMPLE salen solos. Si algo se ve raro, avisa.</w:t>
+        <w:t xml:space="preserve">Si un alumno paga $225 y no encuentra el tutor, prometimos de más y ya cobrado. Ese es el único bloqueo que queda vivo.</w:t>
       </w:r>
     </w:p>
     <w:p>

</xml_diff>